<commit_message>
Conversion PDF via Gotenberg en Vercel y sello pre-convertido a PNG
La conversion docx->PDF del formato institucional de permisos ahora usa
Gotenberg (LibreOffice remoto) cuando GOTENBERG_URL esta configurado, y
sigue usando LibreOffice local si no -- necesario porque Vercel no trae
LibreOffice instalado. El sello institucional para la marca de agua se
pre-convirtio una sola vez a PNG semi-transparente y quedo en
static/img/formato_permiso/, asi que ya no hace falta convertir el SVG
en cada firma (se saca la dependencia de svglib). Se agrega tambien la
plantilla documento_permiso.html y el reemplazo del .doc de permiso
compensatorio por un .docx.

Co-Authored-By: Claude Sonnet 5 <noreply@anthropic.com>
</commit_message>
<xml_diff>
--- a/plantillas_word/PERMISOS ADMINISTRATIVOS.docx
+++ b/plantillas_word/PERMISOS ADMINISTRATIVOS.docx
@@ -1,12 +1,12 @@
 
 <file path=word/document.xml><?xml version="1.0" encoding="utf-8"?>
-<w:document xmlns:wpc="http://schemas.microsoft.com/office/word/2010/wordprocessingCanvas" xmlns:cx="http://schemas.microsoft.com/office/drawing/2014/chartex" xmlns:cx1="http://schemas.microsoft.com/office/drawing/2015/9/8/chartex" xmlns:cx2="http://schemas.microsoft.com/office/drawing/2015/10/21/chartex" xmlns:cx3="http://schemas.microsoft.com/office/drawing/2016/5/9/chartex" xmlns:cx4="http://schemas.microsoft.com/office/drawing/2016/5/10/chartex" xmlns:cx5="http://schemas.microsoft.com/office/drawing/2016/5/11/chartex" xmlns:cx6="http://schemas.microsoft.com/office/drawing/2016/5/12/chartex" xmlns:cx7="http://schemas.microsoft.com/office/drawing/2016/5/13/chartex" xmlns:cx8="http://schemas.microsoft.com/office/drawing/2016/5/14/chartex" xmlns:mc="http://schemas.openxmlformats.org/markup-compatibility/2006" xmlns:aink="http://schemas.microsoft.com/office/drawing/2016/ink" xmlns:am3d="http://schemas.microsoft.com/office/drawing/2017/model3d" xmlns:o="urn:schemas-microsoft-com:office:office" xmlns:oel="http://schemas.microsoft.com/office/2019/extlst" xmlns:r="http://schemas.openxmlformats.org/officeDocument/2006/relationships" xmlns:m="http://schemas.openxmlformats.org/officeDocument/2006/math" xmlns:v="urn:schemas-microsoft-com:vml" xmlns:wp14="http://schemas.microsoft.com/office/word/2010/wordprocessingDrawing" xmlns:wp="http://schemas.openxmlformats.org/drawingml/2006/wordprocessingDrawing" xmlns:w10="urn:schemas-microsoft-com:office:word" xmlns:w="http://schemas.openxmlformats.org/wordprocessingml/2006/main" xmlns:w14="http://schemas.microsoft.com/office/word/2010/wordml" xmlns:w15="http://schemas.microsoft.com/office/word/2012/wordml" xmlns:w16cex="http://schemas.microsoft.com/office/word/2018/wordml/cex" xmlns:w16cid="http://schemas.microsoft.com/office/word/2016/wordml/cid" xmlns:w16="http://schemas.microsoft.com/office/word/2018/wordml" xmlns:w16du="http://schemas.microsoft.com/office/word/2023/wordml/word16du" xmlns:w16sdtdh="http://schemas.microsoft.com/office/word/2020/wordml/sdtdatahash" xmlns:w16se="http://schemas.microsoft.com/office/word/2015/wordml/symex" xmlns:wpg="http://schemas.microsoft.com/office/word/2010/wordprocessingGroup" xmlns:wpi="http://schemas.microsoft.com/office/word/2010/wordprocessingInk" xmlns:wne="http://schemas.microsoft.com/office/word/2006/wordml" xmlns:wps="http://schemas.microsoft.com/office/word/2010/wordprocessingShape" mc:Ignorable="w14 w15 w16se w16cid w16 w16cex w16sdtdh w16du wp14">
+<w:document xmlns:wpc="http://schemas.microsoft.com/office/word/2010/wordprocessingCanvas" xmlns:cx="http://schemas.microsoft.com/office/drawing/2014/chartex" xmlns:cx1="http://schemas.microsoft.com/office/drawing/2015/9/8/chartex" xmlns:cx2="http://schemas.microsoft.com/office/drawing/2015/10/21/chartex" xmlns:cx3="http://schemas.microsoft.com/office/drawing/2016/5/9/chartex" xmlns:cx4="http://schemas.microsoft.com/office/drawing/2016/5/10/chartex" xmlns:cx5="http://schemas.microsoft.com/office/drawing/2016/5/11/chartex" xmlns:cx6="http://schemas.microsoft.com/office/drawing/2016/5/12/chartex" xmlns:cx7="http://schemas.microsoft.com/office/drawing/2016/5/13/chartex" xmlns:cx8="http://schemas.microsoft.com/office/drawing/2016/5/14/chartex" xmlns:mc="http://schemas.openxmlformats.org/markup-compatibility/2006" xmlns:aink="http://schemas.microsoft.com/office/drawing/2016/ink" xmlns:am3d="http://schemas.microsoft.com/office/drawing/2017/model3d" xmlns:o="urn:schemas-microsoft-com:office:office" xmlns:r="http://schemas.openxmlformats.org/officeDocument/2006/relationships" xmlns:m="http://schemas.openxmlformats.org/officeDocument/2006/math" xmlns:v="urn:schemas-microsoft-com:vml" xmlns:wp14="http://schemas.microsoft.com/office/word/2010/wordprocessingDrawing" xmlns:wp="http://schemas.openxmlformats.org/drawingml/2006/wordprocessingDrawing" xmlns:w10="urn:schemas-microsoft-com:office:word" xmlns:w="http://schemas.openxmlformats.org/wordprocessingml/2006/main" xmlns:w14="http://schemas.microsoft.com/office/word/2010/wordml" xmlns:w15="http://schemas.microsoft.com/office/word/2012/wordml" xmlns:w16cex="http://schemas.microsoft.com/office/word/2018/wordml/cex" xmlns:w16cid="http://schemas.microsoft.com/office/word/2016/wordml/cid" xmlns:w16="http://schemas.microsoft.com/office/word/2018/wordml" xmlns:w16sdtdh="http://schemas.microsoft.com/office/word/2020/wordml/sdtdatahash" xmlns:w16se="http://schemas.microsoft.com/office/word/2015/wordml/symex" xmlns:wpg="http://schemas.microsoft.com/office/word/2010/wordprocessingGroup" xmlns:wpi="http://schemas.microsoft.com/office/word/2010/wordprocessingInk" xmlns:wne="http://schemas.microsoft.com/office/word/2006/wordml" xmlns:wps="http://schemas.microsoft.com/office/word/2010/wordprocessingShape" mc:Ignorable="w14 w15 w16se w16cid w16 w16cex w16sdtdh wp14">
   <w:body>
     <w:p>
       <w:pPr>
         <w:keepNext/>
         <w:spacing w:after="0" w:line="240" w:lineRule="auto"/>
-        <w:ind w:left="5245"/>
+        <w:ind w:left="5953" w:firstLine="419"/>
         <w:outlineLvl w:val="0"/>
         <w:rPr>
           <w:rFonts w:ascii="Arial Narrow" w:eastAsia="Times New Roman" w:hAnsi="Arial Narrow" w:cs="Times New Roman"/>
@@ -81,7 +81,7 @@
       <w:pPr>
         <w:keepNext/>
         <w:spacing w:after="0" w:line="240" w:lineRule="auto"/>
-        <w:ind w:left="5245"/>
+        <w:ind w:left="5953" w:firstLine="419"/>
         <w:outlineLvl w:val="0"/>
         <w:rPr>
           <w:rFonts w:ascii="Arial Narrow" w:eastAsia="Times New Roman" w:hAnsi="Arial Narrow" w:cs="Times New Roman"/>
@@ -870,8 +870,8 @@
         <w:tblLook w:val="04A0" w:firstRow="1" w:lastRow="0" w:firstColumn="1" w:lastColumn="0" w:noHBand="0" w:noVBand="1"/>
       </w:tblPr>
       <w:tblGrid>
-        <w:gridCol w:w="2307"/>
-        <w:gridCol w:w="6340"/>
+        <w:gridCol w:w="2376"/>
+        <w:gridCol w:w="6602"/>
       </w:tblGrid>
       <w:tr>
         <w:tc>
@@ -1127,7 +1127,27 @@
           <w:lang w:val="es-MX" w:eastAsia="es-ES"/>
           <w14:ligatures w14:val="none"/>
         </w:rPr>
-        <w:t xml:space="preserve"> B° JEFE DIRECTO</w:t>
+        <w:t xml:space="preserve"> </w:t>
+      </w:r>
+      <w:proofErr w:type="spellStart"/>
+      <w:r>
+        <w:rPr>
+          <w:rFonts w:ascii="Arial Narrow" w:eastAsia="Times New Roman" w:hAnsi="Arial Narrow" w:cs="Times New Roman"/>
+          <w:kern w:val="0"/>
+          <w:lang w:val="es-MX" w:eastAsia="es-ES"/>
+          <w14:ligatures w14:val="none"/>
+        </w:rPr>
+        <w:t>B°</w:t>
+      </w:r>
+      <w:proofErr w:type="spellEnd"/>
+      <w:r>
+        <w:rPr>
+          <w:rFonts w:ascii="Arial Narrow" w:eastAsia="Times New Roman" w:hAnsi="Arial Narrow" w:cs="Times New Roman"/>
+          <w:kern w:val="0"/>
+          <w:lang w:val="es-MX" w:eastAsia="es-ES"/>
+          <w14:ligatures w14:val="none"/>
+        </w:rPr>
+        <w:t xml:space="preserve"> JEFE DIRECTO</w:t>
       </w:r>
     </w:p>
     <w:p>
@@ -1171,6 +1191,30 @@
         </w:rPr>
         <w:t xml:space="preserve">                                                                                                     A L C A L D E S A</w:t>
       </w:r>
+    </w:p>
+    <w:p>
+      <w:pPr>
+        <w:spacing w:after="0" w:line="240" w:lineRule="auto"/>
+        <w:jc w:val="center"/>
+        <w:rPr>
+          <w:rFonts w:ascii="Arial Narrow" w:eastAsia="Times New Roman" w:hAnsi="Arial Narrow" w:cs="Times New Roman"/>
+          <w:kern w:val="0"/>
+          <w:lang w:val="es-MX" w:eastAsia="es-ES"/>
+          <w14:ligatures w14:val="none"/>
+        </w:rPr>
+      </w:pPr>
+    </w:p>
+    <w:p>
+      <w:pPr>
+        <w:spacing w:after="0" w:line="240" w:lineRule="auto"/>
+        <w:jc w:val="center"/>
+        <w:rPr>
+          <w:rFonts w:ascii="Arial Narrow" w:eastAsia="Times New Roman" w:hAnsi="Arial Narrow" w:cs="Times New Roman"/>
+          <w:kern w:val="0"/>
+          <w:lang w:val="es-MX" w:eastAsia="es-ES"/>
+          <w14:ligatures w14:val="none"/>
+        </w:rPr>
+      </w:pPr>
     </w:p>
     <w:p>
       <w:pPr>
@@ -1202,8 +1246,8 @@
         <w:tblLook w:val="04A0" w:firstRow="1" w:lastRow="0" w:firstColumn="1" w:lastColumn="0" w:noHBand="0" w:noVBand="1"/>
       </w:tblPr>
       <w:tblGrid>
-        <w:gridCol w:w="2087"/>
-        <w:gridCol w:w="6560"/>
+        <w:gridCol w:w="2093"/>
+        <w:gridCol w:w="6885"/>
       </w:tblGrid>
       <w:tr>
         <w:tc>
@@ -1282,7 +1326,7 @@
       <w:headerReference w:type="default" r:id="rId7"/>
       <w:footerReference w:type="default" r:id="rId8"/>
       <w:pgSz w:w="11906" w:h="16838" w:code="9"/>
-      <w:pgMar w:top="1417" w:right="1558" w:bottom="1417" w:left="1701" w:header="425" w:footer="1899" w:gutter="0"/>
+      <w:pgMar w:top="720" w:right="720" w:bottom="720" w:left="720" w:header="425" w:footer="0" w:gutter="0"/>
       <w:cols w:space="708"/>
       <w:docGrid w:linePitch="360"/>
     </w:sectPr>
@@ -1291,7 +1335,7 @@
 </file>
 
 <file path=word/endnotes.xml><?xml version="1.0" encoding="utf-8"?>
-<w:endnotes xmlns:wpc="http://schemas.microsoft.com/office/word/2010/wordprocessingCanvas" xmlns:cx="http://schemas.microsoft.com/office/drawing/2014/chartex" xmlns:cx1="http://schemas.microsoft.com/office/drawing/2015/9/8/chartex" xmlns:cx2="http://schemas.microsoft.com/office/drawing/2015/10/21/chartex" xmlns:cx3="http://schemas.microsoft.com/office/drawing/2016/5/9/chartex" xmlns:cx4="http://schemas.microsoft.com/office/drawing/2016/5/10/chartex" xmlns:cx5="http://schemas.microsoft.com/office/drawing/2016/5/11/chartex" xmlns:cx6="http://schemas.microsoft.com/office/drawing/2016/5/12/chartex" xmlns:cx7="http://schemas.microsoft.com/office/drawing/2016/5/13/chartex" xmlns:cx8="http://schemas.microsoft.com/office/drawing/2016/5/14/chartex" xmlns:mc="http://schemas.openxmlformats.org/markup-compatibility/2006" xmlns:aink="http://schemas.microsoft.com/office/drawing/2016/ink" xmlns:am3d="http://schemas.microsoft.com/office/drawing/2017/model3d" xmlns:o="urn:schemas-microsoft-com:office:office" xmlns:oel="http://schemas.microsoft.com/office/2019/extlst" xmlns:r="http://schemas.openxmlformats.org/officeDocument/2006/relationships" xmlns:m="http://schemas.openxmlformats.org/officeDocument/2006/math" xmlns:v="urn:schemas-microsoft-com:vml" xmlns:wp14="http://schemas.microsoft.com/office/word/2010/wordprocessingDrawing" xmlns:wp="http://schemas.openxmlformats.org/drawingml/2006/wordprocessingDrawing" xmlns:w10="urn:schemas-microsoft-com:office:word" xmlns:w="http://schemas.openxmlformats.org/wordprocessingml/2006/main" xmlns:w14="http://schemas.microsoft.com/office/word/2010/wordml" xmlns:w15="http://schemas.microsoft.com/office/word/2012/wordml" xmlns:w16cex="http://schemas.microsoft.com/office/word/2018/wordml/cex" xmlns:w16cid="http://schemas.microsoft.com/office/word/2016/wordml/cid" xmlns:w16="http://schemas.microsoft.com/office/word/2018/wordml" xmlns:w16du="http://schemas.microsoft.com/office/word/2023/wordml/word16du" xmlns:w16sdtdh="http://schemas.microsoft.com/office/word/2020/wordml/sdtdatahash" xmlns:w16se="http://schemas.microsoft.com/office/word/2015/wordml/symex" xmlns:wpg="http://schemas.microsoft.com/office/word/2010/wordprocessingGroup" xmlns:wpi="http://schemas.microsoft.com/office/word/2010/wordprocessingInk" xmlns:wne="http://schemas.microsoft.com/office/word/2006/wordml" xmlns:wps="http://schemas.microsoft.com/office/word/2010/wordprocessingShape" mc:Ignorable="w14 w15 w16se w16cid w16 w16cex w16sdtdh w16du wp14">
+<w:endnotes xmlns:wpc="http://schemas.microsoft.com/office/word/2010/wordprocessingCanvas" xmlns:cx="http://schemas.microsoft.com/office/drawing/2014/chartex" xmlns:cx1="http://schemas.microsoft.com/office/drawing/2015/9/8/chartex" xmlns:cx2="http://schemas.microsoft.com/office/drawing/2015/10/21/chartex" xmlns:cx3="http://schemas.microsoft.com/office/drawing/2016/5/9/chartex" xmlns:cx4="http://schemas.microsoft.com/office/drawing/2016/5/10/chartex" xmlns:cx5="http://schemas.microsoft.com/office/drawing/2016/5/11/chartex" xmlns:cx6="http://schemas.microsoft.com/office/drawing/2016/5/12/chartex" xmlns:cx7="http://schemas.microsoft.com/office/drawing/2016/5/13/chartex" xmlns:cx8="http://schemas.microsoft.com/office/drawing/2016/5/14/chartex" xmlns:mc="http://schemas.openxmlformats.org/markup-compatibility/2006" xmlns:aink="http://schemas.microsoft.com/office/drawing/2016/ink" xmlns:am3d="http://schemas.microsoft.com/office/drawing/2017/model3d" xmlns:o="urn:schemas-microsoft-com:office:office" xmlns:r="http://schemas.openxmlformats.org/officeDocument/2006/relationships" xmlns:m="http://schemas.openxmlformats.org/officeDocument/2006/math" xmlns:v="urn:schemas-microsoft-com:vml" xmlns:wp14="http://schemas.microsoft.com/office/word/2010/wordprocessingDrawing" xmlns:wp="http://schemas.openxmlformats.org/drawingml/2006/wordprocessingDrawing" xmlns:w10="urn:schemas-microsoft-com:office:word" xmlns:w="http://schemas.openxmlformats.org/wordprocessingml/2006/main" xmlns:w14="http://schemas.microsoft.com/office/word/2010/wordml" xmlns:w15="http://schemas.microsoft.com/office/word/2012/wordml" xmlns:w16cex="http://schemas.microsoft.com/office/word/2018/wordml/cex" xmlns:w16cid="http://schemas.microsoft.com/office/word/2016/wordml/cid" xmlns:w16="http://schemas.microsoft.com/office/word/2018/wordml" xmlns:w16sdtdh="http://schemas.microsoft.com/office/word/2020/wordml/sdtdatahash" xmlns:w16se="http://schemas.microsoft.com/office/word/2015/wordml/symex" xmlns:wpg="http://schemas.microsoft.com/office/word/2010/wordprocessingGroup" xmlns:wpi="http://schemas.microsoft.com/office/word/2010/wordprocessingInk" xmlns:wne="http://schemas.microsoft.com/office/word/2006/wordml" xmlns:wps="http://schemas.microsoft.com/office/word/2010/wordprocessingShape" mc:Ignorable="w14 w15 w16se w16cid w16 w16cex w16sdtdh wp14">
   <w:endnote w:type="separator" w:id="-1">
     <w:p>
       <w:pPr>
@@ -1316,51 +1360,52 @@
 </file>
 
 <file path=word/footer1.xml><?xml version="1.0" encoding="utf-8"?>
-<w:ftr xmlns:wpc="http://schemas.microsoft.com/office/word/2010/wordprocessingCanvas" xmlns:cx="http://schemas.microsoft.com/office/drawing/2014/chartex" xmlns:cx1="http://schemas.microsoft.com/office/drawing/2015/9/8/chartex" xmlns:cx2="http://schemas.microsoft.com/office/drawing/2015/10/21/chartex" xmlns:cx3="http://schemas.microsoft.com/office/drawing/2016/5/9/chartex" xmlns:cx4="http://schemas.microsoft.com/office/drawing/2016/5/10/chartex" xmlns:cx5="http://schemas.microsoft.com/office/drawing/2016/5/11/chartex" xmlns:cx6="http://schemas.microsoft.com/office/drawing/2016/5/12/chartex" xmlns:cx7="http://schemas.microsoft.com/office/drawing/2016/5/13/chartex" xmlns:cx8="http://schemas.microsoft.com/office/drawing/2016/5/14/chartex" xmlns:mc="http://schemas.openxmlformats.org/markup-compatibility/2006" xmlns:aink="http://schemas.microsoft.com/office/drawing/2016/ink" xmlns:am3d="http://schemas.microsoft.com/office/drawing/2017/model3d" xmlns:o="urn:schemas-microsoft-com:office:office" xmlns:oel="http://schemas.microsoft.com/office/2019/extlst" xmlns:r="http://schemas.openxmlformats.org/officeDocument/2006/relationships" xmlns:m="http://schemas.openxmlformats.org/officeDocument/2006/math" xmlns:v="urn:schemas-microsoft-com:vml" xmlns:wp14="http://schemas.microsoft.com/office/word/2010/wordprocessingDrawing" xmlns:wp="http://schemas.openxmlformats.org/drawingml/2006/wordprocessingDrawing" xmlns:w10="urn:schemas-microsoft-com:office:word" xmlns:w="http://schemas.openxmlformats.org/wordprocessingml/2006/main" xmlns:w14="http://schemas.microsoft.com/office/word/2010/wordml" xmlns:w15="http://schemas.microsoft.com/office/word/2012/wordml" xmlns:w16cex="http://schemas.microsoft.com/office/word/2018/wordml/cex" xmlns:w16cid="http://schemas.microsoft.com/office/word/2016/wordml/cid" xmlns:w16="http://schemas.microsoft.com/office/word/2018/wordml" xmlns:w16du="http://schemas.microsoft.com/office/word/2023/wordml/word16du" xmlns:w16sdtdh="http://schemas.microsoft.com/office/word/2020/wordml/sdtdatahash" xmlns:w16se="http://schemas.microsoft.com/office/word/2015/wordml/symex" xmlns:wpg="http://schemas.microsoft.com/office/word/2010/wordprocessingGroup" xmlns:wpi="http://schemas.microsoft.com/office/word/2010/wordprocessingInk" xmlns:wne="http://schemas.microsoft.com/office/word/2006/wordml" xmlns:wps="http://schemas.microsoft.com/office/word/2010/wordprocessingShape" mc:Ignorable="w14 w15 w16se w16cid w16 w16cex w16sdtdh w16du wp14">
+<w:ftr xmlns:wpc="http://schemas.microsoft.com/office/word/2010/wordprocessingCanvas" xmlns:cx="http://schemas.microsoft.com/office/drawing/2014/chartex" xmlns:cx1="http://schemas.microsoft.com/office/drawing/2015/9/8/chartex" xmlns:cx2="http://schemas.microsoft.com/office/drawing/2015/10/21/chartex" xmlns:cx3="http://schemas.microsoft.com/office/drawing/2016/5/9/chartex" xmlns:cx4="http://schemas.microsoft.com/office/drawing/2016/5/10/chartex" xmlns:cx5="http://schemas.microsoft.com/office/drawing/2016/5/11/chartex" xmlns:cx6="http://schemas.microsoft.com/office/drawing/2016/5/12/chartex" xmlns:cx7="http://schemas.microsoft.com/office/drawing/2016/5/13/chartex" xmlns:cx8="http://schemas.microsoft.com/office/drawing/2016/5/14/chartex" xmlns:mc="http://schemas.openxmlformats.org/markup-compatibility/2006" xmlns:aink="http://schemas.microsoft.com/office/drawing/2016/ink" xmlns:am3d="http://schemas.microsoft.com/office/drawing/2017/model3d" xmlns:o="urn:schemas-microsoft-com:office:office" xmlns:r="http://schemas.openxmlformats.org/officeDocument/2006/relationships" xmlns:m="http://schemas.openxmlformats.org/officeDocument/2006/math" xmlns:v="urn:schemas-microsoft-com:vml" xmlns:wp14="http://schemas.microsoft.com/office/word/2010/wordprocessingDrawing" xmlns:wp="http://schemas.openxmlformats.org/drawingml/2006/wordprocessingDrawing" xmlns:w10="urn:schemas-microsoft-com:office:word" xmlns:w="http://schemas.openxmlformats.org/wordprocessingml/2006/main" xmlns:w14="http://schemas.microsoft.com/office/word/2010/wordml" xmlns:w15="http://schemas.microsoft.com/office/word/2012/wordml" xmlns:w16cex="http://schemas.microsoft.com/office/word/2018/wordml/cex" xmlns:w16cid="http://schemas.microsoft.com/office/word/2016/wordml/cid" xmlns:w16="http://schemas.microsoft.com/office/word/2018/wordml" xmlns:w16sdtdh="http://schemas.microsoft.com/office/word/2020/wordml/sdtdatahash" xmlns:w16se="http://schemas.microsoft.com/office/word/2015/wordml/symex" xmlns:wpg="http://schemas.microsoft.com/office/word/2010/wordprocessingGroup" xmlns:wpi="http://schemas.microsoft.com/office/word/2010/wordprocessingInk" xmlns:wne="http://schemas.microsoft.com/office/word/2006/wordml" xmlns:wps="http://schemas.microsoft.com/office/word/2010/wordprocessingShape" mc:Ignorable="w14 w15 w16se w16cid w16 w16cex w16sdtdh wp14">
   <w:p>
     <w:pPr>
       <w:tabs>
         <w:tab w:val="center" w:pos="4419"/>
         <w:tab w:val="right" w:pos="8838"/>
       </w:tabs>
-      <w:spacing w:after="0" w:line="240" w:lineRule="auto"/>
       <w:rPr>
-        <w:rFonts w:ascii="Times New Roman" w:eastAsia="Times New Roman" w:hAnsi="Times New Roman" w:cs="Times New Roman"/>
+        <w:rFonts w:ascii="Times New Roman" w:hAnsi="Times New Roman" w:cs="Times New Roman"/>
         <w:b/>
         <w:bCs/>
         <w:i/>
         <w:iCs/>
         <w:color w:val="70AD47"/>
-        <w:kern w:val="0"/>
         <w:sz w:val="20"/>
         <w:szCs w:val="20"/>
-        <w:lang w:eastAsia="es-ES"/>
-        <w14:ligatures w14:val="none"/>
       </w:rPr>
     </w:pPr>
     <w:r>
       <w:rPr>
-        <w:rFonts w:ascii="Times New Roman" w:eastAsia="Times New Roman" w:hAnsi="Times New Roman" w:cs="Times New Roman"/>
+        <w:b/>
+        <w:i/>
         <w:noProof/>
-        <w:kern w:val="0"/>
-        <w:sz w:val="20"/>
-        <w:szCs w:val="20"/>
-        <w:lang w:val="es-ES" w:eastAsia="es-ES"/>
-        <w14:ligatures w14:val="none"/>
+        <w:color w:val="70AD47"/>
       </w:rPr>
       <w:drawing>
-        <wp:anchor distT="0" distB="1651" distL="114300" distR="114300" simplePos="0" relativeHeight="251660288" behindDoc="1" locked="0" layoutInCell="1" allowOverlap="1" wp14:anchorId="674F25F0" wp14:editId="0F78C304">
+        <wp:anchor distT="0" distB="0" distL="114300" distR="114300" simplePos="0" relativeHeight="251663360" behindDoc="1" locked="0" layoutInCell="1" allowOverlap="1" wp14:anchorId="4A1C5BEA" wp14:editId="4DA24515">
           <wp:simplePos x="0" y="0"/>
           <wp:positionH relativeFrom="margin">
-            <wp:align>left</wp:align>
+            <wp:align>center</wp:align>
           </wp:positionH>
           <wp:positionV relativeFrom="paragraph">
-            <wp:posOffset>6350</wp:posOffset>
+            <wp:posOffset>-53340</wp:posOffset>
           </wp:positionV>
-          <wp:extent cx="5763260" cy="248539"/>
-          <wp:effectExtent l="0" t="0" r="8890" b="0"/>
-          <wp:wrapNone/>
-          <wp:docPr id="217580829" name="Imagen 2"/>
+          <wp:extent cx="6339840" cy="262255"/>
+          <wp:effectExtent l="0" t="0" r="3810" b="4445"/>
+          <wp:wrapTight wrapText="bothSides">
+            <wp:wrapPolygon edited="0">
+              <wp:start x="21600" y="21600"/>
+              <wp:lineTo x="21600" y="1203"/>
+              <wp:lineTo x="52" y="1203"/>
+              <wp:lineTo x="52" y="21600"/>
+              <wp:lineTo x="21600" y="21600"/>
+            </wp:wrapPolygon>
+          </wp:wrapTight>
+          <wp:docPr id="2" name="Imagen 1"/>
           <wp:cNvGraphicFramePr>
             <a:graphicFrameLocks xmlns:a="http://schemas.openxmlformats.org/drawingml/2006/main" noChangeAspect="1"/>
           </wp:cNvGraphicFramePr>
@@ -1368,23 +1413,36 @@
             <a:graphicData uri="http://schemas.openxmlformats.org/drawingml/2006/picture">
               <pic:pic xmlns:pic="http://schemas.openxmlformats.org/drawingml/2006/picture">
                 <pic:nvPicPr>
-                  <pic:cNvPr id="9" name="Gráfico 9"/>
-                  <pic:cNvPicPr/>
+                  <pic:cNvPr id="0" name="Imagen 1"/>
+                  <pic:cNvPicPr>
+                    <a:picLocks noChangeAspect="1" noChangeArrowheads="1"/>
+                  </pic:cNvPicPr>
                 </pic:nvPicPr>
                 <pic:blipFill>
-                  <a:blip r:embed="rId1"/>
+                  <a:blip r:embed="rId1">
+                    <a:extLst>
+                      <a:ext uri="{28A0092B-C50C-407E-A947-70E740481C1C}">
+                        <a14:useLocalDpi xmlns:a14="http://schemas.microsoft.com/office/drawing/2010/main" val="0"/>
+                      </a:ext>
+                    </a:extLst>
+                  </a:blip>
+                  <a:srcRect/>
                   <a:stretch>
                     <a:fillRect/>
                   </a:stretch>
                 </pic:blipFill>
-                <pic:spPr>
-                  <a:xfrm>
+                <pic:spPr bwMode="auto">
+                  <a:xfrm rot="10800000" flipV="1">
                     <a:off x="0" y="0"/>
-                    <a:ext cx="5763260" cy="248285"/>
+                    <a:ext cx="6339840" cy="262255"/>
                   </a:xfrm>
                   <a:prstGeom prst="rect">
                     <a:avLst/>
                   </a:prstGeom>
+                  <a:noFill/>
+                  <a:ln>
+                    <a:noFill/>
+                  </a:ln>
                 </pic:spPr>
               </pic:pic>
             </a:graphicData>
@@ -1398,58 +1456,30 @@
         </wp:anchor>
       </w:drawing>
     </w:r>
-  </w:p>
-  <w:p>
-    <w:pPr>
-      <w:tabs>
-        <w:tab w:val="center" w:pos="4419"/>
-        <w:tab w:val="right" w:pos="8838"/>
-      </w:tabs>
-      <w:spacing w:after="0" w:line="240" w:lineRule="auto"/>
+    <w:r>
       <w:rPr>
-        <w:rFonts w:ascii="Times New Roman" w:eastAsia="Times New Roman" w:hAnsi="Times New Roman" w:cs="Times New Roman"/>
+        <w:rFonts w:ascii="Times New Roman" w:hAnsi="Times New Roman" w:cs="Times New Roman"/>
         <w:b/>
         <w:bCs/>
         <w:i/>
         <w:iCs/>
         <w:color w:val="70AD47"/>
-        <w:kern w:val="0"/>
         <w:sz w:val="20"/>
         <w:szCs w:val="20"/>
-        <w:lang w:eastAsia="es-ES"/>
-        <w14:ligatures w14:val="none"/>
       </w:rPr>
-    </w:pPr>
-  </w:p>
-  <w:p>
-    <w:pPr>
-      <w:tabs>
-        <w:tab w:val="center" w:pos="4419"/>
-        <w:tab w:val="right" w:pos="8838"/>
-      </w:tabs>
-      <w:spacing w:after="0" w:line="240" w:lineRule="auto"/>
-      <w:rPr>
-        <w:rFonts w:ascii="Times New Roman" w:eastAsia="Times New Roman" w:hAnsi="Times New Roman" w:cs="Times New Roman"/>
-        <w:kern w:val="0"/>
-        <w:szCs w:val="20"/>
-        <w:lang w:val="es-ES" w:eastAsia="es-ES"/>
-        <w14:ligatures w14:val="none"/>
-      </w:rPr>
-    </w:pPr>
+      <w:t xml:space="preserve">         </w:t>
+    </w:r>
     <w:bookmarkStart w:id="0" w:name="_Hlk141876061"/>
     <w:r>
       <w:rPr>
-        <w:rFonts w:ascii="Times New Roman" w:eastAsia="Times New Roman" w:hAnsi="Times New Roman" w:cs="Times New Roman"/>
+        <w:rFonts w:ascii="Times New Roman" w:hAnsi="Times New Roman" w:cs="Times New Roman"/>
         <w:b/>
         <w:bCs/>
         <w:i/>
         <w:iCs/>
         <w:color w:val="70AD47"/>
-        <w:kern w:val="0"/>
         <w:sz w:val="20"/>
         <w:szCs w:val="20"/>
-        <w:lang w:eastAsia="es-ES"/>
-        <w14:ligatures w14:val="none"/>
       </w:rPr>
       <w:t>Ilustre Municipalidad de Olivar – Teléfono de Contacto (72) 235 8370 – (72) 235 8300 - Plaza Esmeralda S/N, Olivar</w:t>
     </w:r>
@@ -1457,34 +1487,14 @@
   </w:p>
   <w:p>
     <w:pPr>
-      <w:tabs>
-        <w:tab w:val="center" w:pos="4419"/>
-        <w:tab w:val="right" w:pos="8838"/>
-      </w:tabs>
-      <w:spacing w:after="0" w:line="240" w:lineRule="auto"/>
-      <w:rPr>
-        <w:rFonts w:ascii="Times New Roman" w:eastAsia="Times New Roman" w:hAnsi="Times New Roman" w:cs="Times New Roman"/>
-        <w:kern w:val="0"/>
-        <w:sz w:val="20"/>
-        <w:szCs w:val="20"/>
-        <w:lang w:val="es-ES" w:eastAsia="es-ES"/>
-        <w14:ligatures w14:val="none"/>
-      </w:rPr>
-    </w:pPr>
-  </w:p>
-  <w:p>
-    <w:pPr>
       <w:pStyle w:val="Piedepgina"/>
-      <w:rPr>
-        <w:lang w:val="es-ES"/>
-      </w:rPr>
     </w:pPr>
   </w:p>
 </w:ftr>
 </file>
 
 <file path=word/footnotes.xml><?xml version="1.0" encoding="utf-8"?>
-<w:footnotes xmlns:wpc="http://schemas.microsoft.com/office/word/2010/wordprocessingCanvas" xmlns:cx="http://schemas.microsoft.com/office/drawing/2014/chartex" xmlns:cx1="http://schemas.microsoft.com/office/drawing/2015/9/8/chartex" xmlns:cx2="http://schemas.microsoft.com/office/drawing/2015/10/21/chartex" xmlns:cx3="http://schemas.microsoft.com/office/drawing/2016/5/9/chartex" xmlns:cx4="http://schemas.microsoft.com/office/drawing/2016/5/10/chartex" xmlns:cx5="http://schemas.microsoft.com/office/drawing/2016/5/11/chartex" xmlns:cx6="http://schemas.microsoft.com/office/drawing/2016/5/12/chartex" xmlns:cx7="http://schemas.microsoft.com/office/drawing/2016/5/13/chartex" xmlns:cx8="http://schemas.microsoft.com/office/drawing/2016/5/14/chartex" xmlns:mc="http://schemas.openxmlformats.org/markup-compatibility/2006" xmlns:aink="http://schemas.microsoft.com/office/drawing/2016/ink" xmlns:am3d="http://schemas.microsoft.com/office/drawing/2017/model3d" xmlns:o="urn:schemas-microsoft-com:office:office" xmlns:oel="http://schemas.microsoft.com/office/2019/extlst" xmlns:r="http://schemas.openxmlformats.org/officeDocument/2006/relationships" xmlns:m="http://schemas.openxmlformats.org/officeDocument/2006/math" xmlns:v="urn:schemas-microsoft-com:vml" xmlns:wp14="http://schemas.microsoft.com/office/word/2010/wordprocessingDrawing" xmlns:wp="http://schemas.openxmlformats.org/drawingml/2006/wordprocessingDrawing" xmlns:w10="urn:schemas-microsoft-com:office:word" xmlns:w="http://schemas.openxmlformats.org/wordprocessingml/2006/main" xmlns:w14="http://schemas.microsoft.com/office/word/2010/wordml" xmlns:w15="http://schemas.microsoft.com/office/word/2012/wordml" xmlns:w16cex="http://schemas.microsoft.com/office/word/2018/wordml/cex" xmlns:w16cid="http://schemas.microsoft.com/office/word/2016/wordml/cid" xmlns:w16="http://schemas.microsoft.com/office/word/2018/wordml" xmlns:w16du="http://schemas.microsoft.com/office/word/2023/wordml/word16du" xmlns:w16sdtdh="http://schemas.microsoft.com/office/word/2020/wordml/sdtdatahash" xmlns:w16se="http://schemas.microsoft.com/office/word/2015/wordml/symex" xmlns:wpg="http://schemas.microsoft.com/office/word/2010/wordprocessingGroup" xmlns:wpi="http://schemas.microsoft.com/office/word/2010/wordprocessingInk" xmlns:wne="http://schemas.microsoft.com/office/word/2006/wordml" xmlns:wps="http://schemas.microsoft.com/office/word/2010/wordprocessingShape" mc:Ignorable="w14 w15 w16se w16cid w16 w16cex w16sdtdh w16du wp14">
+<w:footnotes xmlns:wpc="http://schemas.microsoft.com/office/word/2010/wordprocessingCanvas" xmlns:cx="http://schemas.microsoft.com/office/drawing/2014/chartex" xmlns:cx1="http://schemas.microsoft.com/office/drawing/2015/9/8/chartex" xmlns:cx2="http://schemas.microsoft.com/office/drawing/2015/10/21/chartex" xmlns:cx3="http://schemas.microsoft.com/office/drawing/2016/5/9/chartex" xmlns:cx4="http://schemas.microsoft.com/office/drawing/2016/5/10/chartex" xmlns:cx5="http://schemas.microsoft.com/office/drawing/2016/5/11/chartex" xmlns:cx6="http://schemas.microsoft.com/office/drawing/2016/5/12/chartex" xmlns:cx7="http://schemas.microsoft.com/office/drawing/2016/5/13/chartex" xmlns:cx8="http://schemas.microsoft.com/office/drawing/2016/5/14/chartex" xmlns:mc="http://schemas.openxmlformats.org/markup-compatibility/2006" xmlns:aink="http://schemas.microsoft.com/office/drawing/2016/ink" xmlns:am3d="http://schemas.microsoft.com/office/drawing/2017/model3d" xmlns:o="urn:schemas-microsoft-com:office:office" xmlns:r="http://schemas.openxmlformats.org/officeDocument/2006/relationships" xmlns:m="http://schemas.openxmlformats.org/officeDocument/2006/math" xmlns:v="urn:schemas-microsoft-com:vml" xmlns:wp14="http://schemas.microsoft.com/office/word/2010/wordprocessingDrawing" xmlns:wp="http://schemas.openxmlformats.org/drawingml/2006/wordprocessingDrawing" xmlns:w10="urn:schemas-microsoft-com:office:word" xmlns:w="http://schemas.openxmlformats.org/wordprocessingml/2006/main" xmlns:w14="http://schemas.microsoft.com/office/word/2010/wordml" xmlns:w15="http://schemas.microsoft.com/office/word/2012/wordml" xmlns:w16cex="http://schemas.microsoft.com/office/word/2018/wordml/cex" xmlns:w16cid="http://schemas.microsoft.com/office/word/2016/wordml/cid" xmlns:w16="http://schemas.microsoft.com/office/word/2018/wordml" xmlns:w16sdtdh="http://schemas.microsoft.com/office/word/2020/wordml/sdtdatahash" xmlns:w16se="http://schemas.microsoft.com/office/word/2015/wordml/symex" xmlns:wpg="http://schemas.microsoft.com/office/word/2010/wordprocessingGroup" xmlns:wpi="http://schemas.microsoft.com/office/word/2010/wordprocessingInk" xmlns:wne="http://schemas.microsoft.com/office/word/2006/wordml" xmlns:wps="http://schemas.microsoft.com/office/word/2010/wordprocessingShape" mc:Ignorable="w14 w15 w16se w16cid w16 w16cex w16sdtdh wp14">
   <w:footnote w:type="separator" w:id="-1">
     <w:p>
       <w:pPr>
@@ -1509,7 +1519,7 @@
 </file>
 
 <file path=word/header1.xml><?xml version="1.0" encoding="utf-8"?>
-<w:hdr xmlns:wpc="http://schemas.microsoft.com/office/word/2010/wordprocessingCanvas" xmlns:cx="http://schemas.microsoft.com/office/drawing/2014/chartex" xmlns:cx1="http://schemas.microsoft.com/office/drawing/2015/9/8/chartex" xmlns:cx2="http://schemas.microsoft.com/office/drawing/2015/10/21/chartex" xmlns:cx3="http://schemas.microsoft.com/office/drawing/2016/5/9/chartex" xmlns:cx4="http://schemas.microsoft.com/office/drawing/2016/5/10/chartex" xmlns:cx5="http://schemas.microsoft.com/office/drawing/2016/5/11/chartex" xmlns:cx6="http://schemas.microsoft.com/office/drawing/2016/5/12/chartex" xmlns:cx7="http://schemas.microsoft.com/office/drawing/2016/5/13/chartex" xmlns:cx8="http://schemas.microsoft.com/office/drawing/2016/5/14/chartex" xmlns:mc="http://schemas.openxmlformats.org/markup-compatibility/2006" xmlns:aink="http://schemas.microsoft.com/office/drawing/2016/ink" xmlns:am3d="http://schemas.microsoft.com/office/drawing/2017/model3d" xmlns:o="urn:schemas-microsoft-com:office:office" xmlns:oel="http://schemas.microsoft.com/office/2019/extlst" xmlns:r="http://schemas.openxmlformats.org/officeDocument/2006/relationships" xmlns:m="http://schemas.openxmlformats.org/officeDocument/2006/math" xmlns:v="urn:schemas-microsoft-com:vml" xmlns:wp14="http://schemas.microsoft.com/office/word/2010/wordprocessingDrawing" xmlns:wp="http://schemas.openxmlformats.org/drawingml/2006/wordprocessingDrawing" xmlns:w10="urn:schemas-microsoft-com:office:word" xmlns:w="http://schemas.openxmlformats.org/wordprocessingml/2006/main" xmlns:w14="http://schemas.microsoft.com/office/word/2010/wordml" xmlns:w15="http://schemas.microsoft.com/office/word/2012/wordml" xmlns:w16cex="http://schemas.microsoft.com/office/word/2018/wordml/cex" xmlns:w16cid="http://schemas.microsoft.com/office/word/2016/wordml/cid" xmlns:w16="http://schemas.microsoft.com/office/word/2018/wordml" xmlns:w16du="http://schemas.microsoft.com/office/word/2023/wordml/word16du" xmlns:w16sdtdh="http://schemas.microsoft.com/office/word/2020/wordml/sdtdatahash" xmlns:w16se="http://schemas.microsoft.com/office/word/2015/wordml/symex" xmlns:wpg="http://schemas.microsoft.com/office/word/2010/wordprocessingGroup" xmlns:wpi="http://schemas.microsoft.com/office/word/2010/wordprocessingInk" xmlns:wne="http://schemas.microsoft.com/office/word/2006/wordml" xmlns:wps="http://schemas.microsoft.com/office/word/2010/wordprocessingShape" mc:Ignorable="w14 w15 w16se w16cid w16 w16cex w16sdtdh w16du wp14">
+<w:hdr xmlns:wpc="http://schemas.microsoft.com/office/word/2010/wordprocessingCanvas" xmlns:cx="http://schemas.microsoft.com/office/drawing/2014/chartex" xmlns:cx1="http://schemas.microsoft.com/office/drawing/2015/9/8/chartex" xmlns:cx2="http://schemas.microsoft.com/office/drawing/2015/10/21/chartex" xmlns:cx3="http://schemas.microsoft.com/office/drawing/2016/5/9/chartex" xmlns:cx4="http://schemas.microsoft.com/office/drawing/2016/5/10/chartex" xmlns:cx5="http://schemas.microsoft.com/office/drawing/2016/5/11/chartex" xmlns:cx6="http://schemas.microsoft.com/office/drawing/2016/5/12/chartex" xmlns:cx7="http://schemas.microsoft.com/office/drawing/2016/5/13/chartex" xmlns:cx8="http://schemas.microsoft.com/office/drawing/2016/5/14/chartex" xmlns:mc="http://schemas.openxmlformats.org/markup-compatibility/2006" xmlns:aink="http://schemas.microsoft.com/office/drawing/2016/ink" xmlns:am3d="http://schemas.microsoft.com/office/drawing/2017/model3d" xmlns:o="urn:schemas-microsoft-com:office:office" xmlns:r="http://schemas.openxmlformats.org/officeDocument/2006/relationships" xmlns:m="http://schemas.openxmlformats.org/officeDocument/2006/math" xmlns:v="urn:schemas-microsoft-com:vml" xmlns:wp14="http://schemas.microsoft.com/office/word/2010/wordprocessingDrawing" xmlns:wp="http://schemas.openxmlformats.org/drawingml/2006/wordprocessingDrawing" xmlns:w10="urn:schemas-microsoft-com:office:word" xmlns:w="http://schemas.openxmlformats.org/wordprocessingml/2006/main" xmlns:w14="http://schemas.microsoft.com/office/word/2010/wordml" xmlns:w15="http://schemas.microsoft.com/office/word/2012/wordml" xmlns:w16cex="http://schemas.microsoft.com/office/word/2018/wordml/cex" xmlns:w16cid="http://schemas.microsoft.com/office/word/2016/wordml/cid" xmlns:w16="http://schemas.microsoft.com/office/word/2018/wordml" xmlns:w16sdtdh="http://schemas.microsoft.com/office/word/2020/wordml/sdtdatahash" xmlns:w16se="http://schemas.microsoft.com/office/word/2015/wordml/symex" xmlns:wpg="http://schemas.microsoft.com/office/word/2010/wordprocessingGroup" xmlns:wpi="http://schemas.microsoft.com/office/word/2010/wordprocessingInk" xmlns:wne="http://schemas.microsoft.com/office/word/2006/wordml" xmlns:wps="http://schemas.microsoft.com/office/word/2010/wordprocessingShape" mc:Ignorable="w14 w15 w16se w16cid w16 w16cex w16sdtdh wp14">
   <w:p>
     <w:pPr>
       <w:pStyle w:val="Encabezado"/>
@@ -1665,7 +1675,7 @@
 </file>
 
 <file path=word/styles.xml><?xml version="1.0" encoding="utf-8"?>
-<w:styles xmlns:mc="http://schemas.openxmlformats.org/markup-compatibility/2006" xmlns:r="http://schemas.openxmlformats.org/officeDocument/2006/relationships" xmlns:w="http://schemas.openxmlformats.org/wordprocessingml/2006/main" xmlns:w14="http://schemas.microsoft.com/office/word/2010/wordml" xmlns:w15="http://schemas.microsoft.com/office/word/2012/wordml" xmlns:w16cex="http://schemas.microsoft.com/office/word/2018/wordml/cex" xmlns:w16cid="http://schemas.microsoft.com/office/word/2016/wordml/cid" xmlns:w16="http://schemas.microsoft.com/office/word/2018/wordml" xmlns:w16du="http://schemas.microsoft.com/office/word/2023/wordml/word16du" xmlns:w16sdtdh="http://schemas.microsoft.com/office/word/2020/wordml/sdtdatahash" xmlns:w16se="http://schemas.microsoft.com/office/word/2015/wordml/symex" mc:Ignorable="w14 w15 w16se w16cid w16 w16cex w16sdtdh w16du">
+<w:styles xmlns:mc="http://schemas.openxmlformats.org/markup-compatibility/2006" xmlns:r="http://schemas.openxmlformats.org/officeDocument/2006/relationships" xmlns:w="http://schemas.openxmlformats.org/wordprocessingml/2006/main" xmlns:w14="http://schemas.microsoft.com/office/word/2010/wordml" xmlns:w15="http://schemas.microsoft.com/office/word/2012/wordml" xmlns:w16cex="http://schemas.microsoft.com/office/word/2018/wordml/cex" xmlns:w16cid="http://schemas.microsoft.com/office/word/2016/wordml/cid" xmlns:w16="http://schemas.microsoft.com/office/word/2018/wordml" xmlns:w16sdtdh="http://schemas.microsoft.com/office/word/2020/wordml/sdtdatahash" xmlns:w16se="http://schemas.microsoft.com/office/word/2015/wordml/symex" mc:Ignorable="w14 w15 w16se w16cid w16 w16cex w16sdtdh">
   <w:docDefaults>
     <w:rPrDefault>
       <w:rPr>

</xml_diff>